<commit_message>
Updated manuscript and data
</commit_message>
<xml_diff>
--- a/manuscript/Blattabacterium HGT_supp-material_v2_KE_NL_KE.docx
+++ b/manuscript/Blattabacterium HGT_supp-material_v2_KE_NL_KE.docx
@@ -2042,7 +2042,7 @@
         </w:rPr>
         <w:t>insert</w:t>
       </w:r>
-      <w:commentRangeStart w:id="3"/>
+      <w:bookmarkStart w:id="3" w:name="_GoBack"/>
       <w:r>
         <w:rPr>
           <w:rFonts w:ascii="Aptos" w:hAnsi="Aptos" w:cstheme="minorHAnsi"/>
@@ -2052,13 +2052,7 @@
         </w:rPr>
         <w:t>s</w:t>
       </w:r>
-      <w:commentRangeEnd w:id="3"/>
-      <w:r>
-        <w:rPr>
-          <w:rStyle w:val="CommentReference"/>
-        </w:rPr>
-        <w:commentReference w:id="3"/>
-      </w:r>
+      <w:bookmarkEnd w:id="3"/>
     </w:p>
     <w:p>
       <w:pPr>
@@ -3473,31 +3467,60 @@
           <w:rFonts w:ascii="Aptos" w:eastAsia="Times New Roman" w:hAnsi="Aptos" w:cstheme="minorHAnsi"/>
           <w:color w:val="000000" w:themeColor="text1"/>
         </w:rPr>
+        <w:t xml:space="preserve"> Finally, manual auditing of the results </w:t>
+      </w:r>
+      <w:proofErr w:type="gramStart"/>
+      <w:r>
+        <w:rPr>
+          <w:rFonts w:ascii="Aptos" w:eastAsia="Times New Roman" w:hAnsi="Aptos" w:cstheme="minorHAnsi"/>
+          <w:color w:val="000000" w:themeColor="text1"/>
+        </w:rPr>
+        <w:t>were</w:t>
+      </w:r>
+      <w:proofErr w:type="gramEnd"/>
+      <w:r>
+        <w:rPr>
+          <w:rFonts w:ascii="Aptos" w:eastAsia="Times New Roman" w:hAnsi="Aptos" w:cstheme="minorHAnsi"/>
+          <w:color w:val="000000" w:themeColor="text1"/>
+        </w:rPr>
+        <w:t xml:space="preserve"> performed by additional BLASTs and inspections of the sequences themselves.</w:t>
+      </w:r>
+      <w:r>
+        <w:rPr>
+          <w:rFonts w:ascii="Aptos" w:eastAsia="Times New Roman" w:hAnsi="Aptos" w:cstheme="minorHAnsi"/>
+          <w:color w:val="000000" w:themeColor="text1"/>
+        </w:rPr>
         <w:t xml:space="preserve"> </w:t>
       </w:r>
-      <w:commentRangeStart w:id="5"/>
-      <w:r>
-        <w:rPr>
-          <w:rFonts w:ascii="Aptos" w:eastAsia="Times New Roman" w:hAnsi="Aptos" w:cstheme="minorHAnsi"/>
-          <w:color w:val="000000" w:themeColor="text1"/>
-        </w:rPr>
-        <w:t xml:space="preserve">Finally, manual auditing of the results </w:t>
-      </w:r>
-      <w:proofErr w:type="gramStart"/>
-      <w:r>
-        <w:rPr>
-          <w:rFonts w:ascii="Aptos" w:eastAsia="Times New Roman" w:hAnsi="Aptos" w:cstheme="minorHAnsi"/>
-          <w:color w:val="000000" w:themeColor="text1"/>
-        </w:rPr>
-        <w:t>were</w:t>
-      </w:r>
-      <w:proofErr w:type="gramEnd"/>
-      <w:r>
-        <w:rPr>
-          <w:rFonts w:ascii="Aptos" w:eastAsia="Times New Roman" w:hAnsi="Aptos" w:cstheme="minorHAnsi"/>
-          <w:color w:val="000000" w:themeColor="text1"/>
-        </w:rPr>
-        <w:t xml:space="preserve"> performed by additional BLASTs and inspections of the sequences themselves. </w:t>
+      <w:r>
+        <w:rPr>
+          <w:rFonts w:ascii="Aptos" w:eastAsia="Times New Roman" w:hAnsi="Aptos" w:cstheme="minorHAnsi"/>
+          <w:color w:val="000000" w:themeColor="text1"/>
+        </w:rPr>
+        <w:t xml:space="preserve">We were particularly stringent when manually curating the termite putative inserts given the existence of termite gut symbionts that are closely related to </w:t>
+      </w:r>
+      <w:proofErr w:type="spellStart"/>
+      <w:r>
+        <w:rPr>
+          <w:rFonts w:ascii="Aptos" w:eastAsia="Times New Roman" w:hAnsi="Aptos" w:cstheme="minorHAnsi"/>
+          <w:color w:val="000000" w:themeColor="text1"/>
+        </w:rPr>
+        <w:t>Blattabacterium</w:t>
+      </w:r>
+      <w:proofErr w:type="spellEnd"/>
+      <w:r>
+        <w:rPr>
+          <w:rFonts w:ascii="Aptos" w:eastAsia="Times New Roman" w:hAnsi="Aptos" w:cstheme="minorHAnsi"/>
+          <w:color w:val="000000" w:themeColor="text1"/>
+        </w:rPr>
+        <w:t xml:space="preserve"> (e.g. Bacteroides/Flavobacteria).</w:t>
+      </w:r>
+      <w:r>
+        <w:rPr>
+          <w:rFonts w:ascii="Aptos" w:eastAsia="Times New Roman" w:hAnsi="Aptos" w:cstheme="minorHAnsi"/>
+          <w:color w:val="000000" w:themeColor="text1"/>
+        </w:rPr>
+        <w:t xml:space="preserve"> </w:t>
       </w:r>
       <w:r>
         <w:rPr>
@@ -3505,13 +3528,6 @@
           <w:color w:val="000000" w:themeColor="text1"/>
         </w:rPr>
         <w:br/>
-      </w:r>
-      <w:commentRangeEnd w:id="5"/>
-      <w:r>
-        <w:rPr>
-          <w:rStyle w:val="CommentReference"/>
-        </w:rPr>
-        <w:commentReference w:id="5"/>
       </w:r>
       <w:r>
         <w:rPr>
@@ -4493,7 +4509,7 @@
         </w:rPr>
         <w:t xml:space="preserve">ancestral inserts were able to be easily identified and extracted. </w:t>
       </w:r>
-      <w:commentRangeStart w:id="6"/>
+      <w:commentRangeStart w:id="5"/>
       <w:r>
         <w:rPr>
           <w:rFonts w:ascii="Aptos" w:eastAsia="Times New Roman" w:hAnsi="Aptos" w:cstheme="minorHAnsi"/>
@@ -4501,12 +4517,12 @@
         </w:rPr>
         <w:t xml:space="preserve">These putatively ancestral inserts were manually curated by aligning them back to the genomes and checking for sequence synteny. </w:t>
       </w:r>
-      <w:commentRangeEnd w:id="6"/>
+      <w:commentRangeEnd w:id="5"/>
       <w:r>
         <w:rPr>
           <w:rStyle w:val="CommentReference"/>
         </w:rPr>
-        <w:commentReference w:id="6"/>
+        <w:commentReference w:id="5"/>
       </w:r>
       <w:r>
         <w:rPr>
@@ -4708,6 +4724,7 @@
           <w:rFonts w:ascii="Aptos" w:hAnsi="Aptos" w:cstheme="minorHAnsi"/>
           <w:color w:val="FF0000"/>
         </w:rPr>
+        <w:lastRenderedPageBreak/>
         <w:t>Results from alternate thresholds (refer to Figure S2)</w:t>
       </w:r>
       <w:r>
@@ -4935,8 +4952,6 @@
           <w:color w:val="000000" w:themeColor="text1"/>
         </w:rPr>
       </w:pPr>
-      <w:bookmarkStart w:id="7" w:name="_GoBack"/>
-      <w:bookmarkEnd w:id="7"/>
       <w:r>
         <w:rPr>
           <w:rFonts w:ascii="Aptos" w:hAnsi="Aptos" w:cstheme="minorHAnsi"/>
@@ -4978,6 +4993,7 @@
         <w:rPr>
           <w:rFonts w:ascii="Aptos" w:hAnsi="Aptos" w:cstheme="minorHAnsi"/>
           <w:i/>
+          <w:noProof/>
           <w:color w:val="000000" w:themeColor="text1"/>
         </w:rPr>
         <w:drawing>
@@ -5138,7 +5154,15 @@
           <w:rFonts w:ascii="Aptos" w:eastAsia="Times New Roman" w:hAnsi="Aptos" w:cstheme="minorHAnsi"/>
           <w:color w:val="000000" w:themeColor="text1"/>
         </w:rPr>
-        <w:t xml:space="preserve">with standard and alternate filtering threshold applied; the </w:t>
+        <w:t xml:space="preserve">with </w:t>
+      </w:r>
+      <w:r>
+        <w:rPr>
+          <w:rFonts w:ascii="Aptos" w:eastAsia="Times New Roman" w:hAnsi="Aptos" w:cstheme="minorHAnsi"/>
+          <w:color w:val="000000" w:themeColor="text1"/>
+        </w:rPr>
+        <w:lastRenderedPageBreak/>
+        <w:t xml:space="preserve">standard and alternate filtering threshold applied; the </w:t>
       </w:r>
       <w:r>
         <w:rPr>
@@ -5240,7 +5264,7 @@
           <w:highlight w:val="yellow"/>
         </w:rPr>
       </w:pPr>
-      <w:commentRangeStart w:id="8"/>
+      <w:commentRangeStart w:id="6"/>
       <w:r>
         <w:rPr>
           <w:rFonts w:ascii="Aptos" w:hAnsi="Aptos" w:cstheme="minorHAnsi"/>
@@ -5250,7 +5274,7 @@
         </w:rPr>
         <w:t>F</w:t>
       </w:r>
-      <w:commentRangeEnd w:id="8"/>
+      <w:commentRangeEnd w:id="6"/>
       <w:r>
         <w:rPr>
           <w:rStyle w:val="CommentReference"/>
@@ -5258,7 +5282,7 @@
           <w:i/>
           <w:highlight w:val="yellow"/>
         </w:rPr>
-        <w:commentReference w:id="8"/>
+        <w:commentReference w:id="6"/>
       </w:r>
       <w:r>
         <w:rPr>
@@ -5284,7 +5308,7 @@
           <w:i/>
           <w:color w:val="000000" w:themeColor="text1"/>
           <w:highlight w:val="yellow"/>
-          <w:rPrChange w:id="9" w:author="Microsoft Office User" w:date="2025-09-28T20:36:00Z">
+          <w:rPrChange w:id="7" w:author="Microsoft Office User" w:date="2025-09-28T20:36:00Z">
             <w:rPr>
               <w:rFonts w:ascii="Aptos" w:hAnsi="Aptos" w:cstheme="minorHAnsi"/>
               <w:i/>
@@ -10210,6 +10234,7 @@
                 <w:szCs w:val="20"/>
                 <w:lang w:eastAsia="zh-CN"/>
               </w:rPr>
+              <w:lastRenderedPageBreak/>
               <w:t>Blattabacterium</w:t>
             </w:r>
             <w:proofErr w:type="spellEnd"/>
@@ -10596,7 +10621,6 @@
                 <w:szCs w:val="20"/>
                 <w:lang w:eastAsia="zh-CN"/>
               </w:rPr>
-              <w:lastRenderedPageBreak/>
               <w:t>Blattabacterium</w:t>
             </w:r>
             <w:proofErr w:type="spellEnd"/>
@@ -15615,6 +15639,7 @@
                 <w:szCs w:val="20"/>
                 <w:lang w:eastAsia="zh-CN"/>
               </w:rPr>
+              <w:lastRenderedPageBreak/>
               <w:t>Blattabacterium</w:t>
             </w:r>
             <w:proofErr w:type="spellEnd"/>
@@ -16001,7 +16026,6 @@
                 <w:szCs w:val="20"/>
                 <w:lang w:eastAsia="zh-CN"/>
               </w:rPr>
-              <w:lastRenderedPageBreak/>
               <w:t>Blattabacterium</w:t>
             </w:r>
             <w:proofErr w:type="spellEnd"/>
@@ -21020,6 +21044,7 @@
                 <w:szCs w:val="20"/>
                 <w:lang w:eastAsia="zh-CN"/>
               </w:rPr>
+              <w:lastRenderedPageBreak/>
               <w:t>Blattabacterium</w:t>
             </w:r>
             <w:proofErr w:type="spellEnd"/>
@@ -21406,7 +21431,6 @@
                 <w:szCs w:val="20"/>
                 <w:lang w:eastAsia="zh-CN"/>
               </w:rPr>
-              <w:lastRenderedPageBreak/>
               <w:t>Blattabacterium</w:t>
             </w:r>
             <w:proofErr w:type="spellEnd"/>
@@ -25720,7 +25744,7 @@
                 <w:lang w:eastAsia="zh-CN"/>
               </w:rPr>
             </w:pPr>
-            <w:commentRangeStart w:id="10"/>
+            <w:commentRangeStart w:id="8"/>
             <w:r>
               <w:rPr>
                 <w:rFonts w:eastAsia="Times New Roman" w:cstheme="minorHAnsi"/>
@@ -25731,12 +25755,12 @@
               </w:rPr>
               <w:t>Z1</w:t>
             </w:r>
-            <w:commentRangeEnd w:id="10"/>
+            <w:commentRangeEnd w:id="8"/>
             <w:r>
               <w:rPr>
                 <w:rStyle w:val="CommentReference"/>
               </w:rPr>
-              <w:commentReference w:id="10"/>
+              <w:commentReference w:id="8"/>
             </w:r>
           </w:p>
         </w:tc>
@@ -26634,6 +26658,7 @@
                 <w:szCs w:val="20"/>
                 <w:lang w:eastAsia="zh-CN"/>
               </w:rPr>
+              <w:lastRenderedPageBreak/>
               <w:t>Z010</w:t>
             </w:r>
           </w:p>
@@ -27248,7 +27273,6 @@
                 <w:szCs w:val="20"/>
                 <w:lang w:eastAsia="zh-CN"/>
               </w:rPr>
-              <w:lastRenderedPageBreak/>
               <w:t>Z012</w:t>
             </w:r>
           </w:p>
@@ -28642,30 +28666,6 @@
       </w:r>
     </w:p>
   </w:comment>
-  <w:comment w:id="3" w:author="Microsoft Office User" w:date="2025-10-20T20:51:00Z" w:initials="MOU">
-    <w:p>
-      <w:pPr>
-        <w:pStyle w:val="CommentText"/>
-      </w:pPr>
-      <w:r>
-        <w:rPr>
-          <w:rStyle w:val="CommentReference"/>
-        </w:rPr>
-        <w:annotationRef/>
-      </w:r>
-      <w:r>
-        <w:t xml:space="preserve">Make sure I </w:t>
-      </w:r>
-      <w:proofErr w:type="spellStart"/>
-      <w:r>
-        <w:t>addt</w:t>
-      </w:r>
-      <w:proofErr w:type="spellEnd"/>
-      <w:r>
-        <w:t xml:space="preserve"> eh 2 manual curation steps here as well</w:t>
-      </w:r>
-    </w:p>
-  </w:comment>
   <w:comment w:id="4" w:author="Microsoft Office User" w:date="2025-09-28T21:32:00Z" w:initials="MOU">
     <w:p>
       <w:pPr>
@@ -28688,7 +28688,7 @@
       </w:r>
     </w:p>
   </w:comment>
-  <w:comment w:id="5" w:author="Microsoft Office User" w:date="2025-10-17T13:10:00Z" w:initials="MOU">
+  <w:comment w:id="5" w:author="Microsoft Office User" w:date="2025-10-17T13:14:00Z" w:initials="MOU">
     <w:p>
       <w:pPr>
         <w:pStyle w:val="CommentText"/>
@@ -28700,11 +28700,11 @@
         <w:annotationRef/>
       </w:r>
       <w:r>
-        <w:t>This is the final audit that was done by Maya and myself. Sound okay?</w:t>
+        <w:t>Does this accurately capture the auditing of these old inserts?</w:t>
       </w:r>
     </w:p>
   </w:comment>
-  <w:comment w:id="6" w:author="Microsoft Office User" w:date="2025-10-17T13:14:00Z" w:initials="MOU">
+  <w:comment w:id="6" w:author="Kyle Ewart" w:date="2024-12-02T22:30:00Z" w:initials="KE">
     <w:p>
       <w:pPr>
         <w:pStyle w:val="CommentText"/>
@@ -28716,27 +28716,11 @@
         <w:annotationRef/>
       </w:r>
       <w:r>
-        <w:t>Does this accurately capture the auditing of these old inserts?</w:t>
+        <w:t>These are just initial thoughts. We can have many panels and just add what can’t fit into the main panel</w:t>
       </w:r>
     </w:p>
   </w:comment>
-  <w:comment w:id="8" w:author="Kyle Ewart" w:date="2024-12-02T22:30:00Z" w:initials="KE">
-    <w:p>
-      <w:pPr>
-        <w:pStyle w:val="CommentText"/>
-      </w:pPr>
-      <w:r>
-        <w:rPr>
-          <w:rStyle w:val="CommentReference"/>
-        </w:rPr>
-        <w:annotationRef/>
-      </w:r>
-      <w:r>
-        <w:t>These are just initial thoughts. We can have many panels and just add what can’t fit into the main panel</w:t>
-      </w:r>
-    </w:p>
-  </w:comment>
-  <w:comment w:id="10" w:author="Microsoft Office User" w:date="2025-09-28T20:58:00Z" w:initials="MOU">
+  <w:comment w:id="8" w:author="Microsoft Office User" w:date="2025-09-28T20:58:00Z" w:initials="MOU">
     <w:p>
       <w:pPr>
         <w:pStyle w:val="CommentText"/>
@@ -28760,9 +28744,7 @@
   <w15:commentEx w15:paraId="7186EF34" w15:done="0"/>
   <w15:commentEx w15:paraId="56876713" w15:paraIdParent="7186EF34" w15:done="0"/>
   <w15:commentEx w15:paraId="0A4CE996" w15:done="0"/>
-  <w15:commentEx w15:paraId="0E1C8698" w15:done="0"/>
   <w15:commentEx w15:paraId="4641E8BC" w15:done="0"/>
-  <w15:commentEx w15:paraId="6B93D1C1" w15:done="0"/>
   <w15:commentEx w15:paraId="60144F0F" w15:done="0"/>
   <w15:commentEx w15:paraId="1EECDDE1" w15:done="0"/>
   <w15:commentEx w15:paraId="5F75ADC1" w15:done="0"/>
@@ -28792,9 +28774,7 @@
   <w16cid:commentId w16cid:paraId="7186EF34" w16cid:durableId="2C8391C7"/>
   <w16cid:commentId w16cid:paraId="56876713" w16cid:durableId="2C9B90AD"/>
   <w16cid:commentId w16cid:paraId="0A4CE996" w16cid:durableId="2AF8B0EA"/>
-  <w16cid:commentId w16cid:paraId="0E1C8698" w16cid:durableId="2CA11F55"/>
   <w16cid:commentId w16cid:paraId="4641E8BC" w16cid:durableId="2C8427D6"/>
-  <w16cid:commentId w16cid:paraId="6B93D1C1" w16cid:durableId="2C9CBED0"/>
   <w16cid:commentId w16cid:paraId="60144F0F" w16cid:durableId="2C9CBFC8"/>
   <w16cid:commentId w16cid:paraId="1EECDDE1" w16cid:durableId="2AF8B381"/>
   <w16cid:commentId w16cid:paraId="5F75ADC1" w16cid:durableId="2C841FED"/>

</xml_diff>